<commit_message>
Backlog ClickUp GA4: consolidacion de tracking y tareas agencia/cliente
</commit_message>
<xml_diff>
--- a/descargables/Backlog-ClickUp-GA4.docx
+++ b/descargables/Backlog-ClickUp-GA4.docx
@@ -28,7 +28,7 @@
         <w:t xml:space="preserve">Estado: </w:t>
       </w:r>
       <w:r>
-        <w:t>Pre-auditoría — basado en hallazgos ya confirmados de auditorías previas (tracking, WordPress, 14 URL de campañas).</w:t>
+        <w:t>Confirmado con datos reales (ver Auditoría Completa GA4).</w:t>
         <w:br/>
       </w:r>
       <w:r>
@@ -46,7 +46,7 @@
         <w:rPr>
           <w:i/>
         </w:rPr>
-        <w:t>Nota de estado: el servidor MCP oficial de Google Analytics (googleanalytics/google-analytics-mcp) quedó instalado y con credenciales reales configuradas en esta sesión de trabajo, pero requiere un reinicio de la sesión de Claude Code para cargar. Este backlog se armó con lo que ya está confirmado por auditorías anteriores. Apenas se ejecute la auditoría en vivo, este documento se complementa con datos reales de tráfico, conversión y calidad de eventos — no reemplaza esa auditoría, la prepara.</w:t>
+        <w:t>Nota de método: la sesión interactiva de Claude Code no logró cargar el servidor MCP de Google Analytics recién instalado, ni tras un reinicio. Se conectó manualmente hablando el protocolo MCP (JSON-RPC sobre stdio) directamente contra el proceso pipx run analytics-mcp, con las mismas credenciales ya configuradas — los datos de este backlog son reales, no estimados. Algunas tareas de la primera versión de este backlog quedaron corregidas o eliminadas al confirmarse con datos reales.</w:t>
       </w:r>
     </w:p>
     <w:p>
@@ -54,7 +54,7 @@
         <w:pStyle w:val="Heading1"/>
       </w:pPr>
       <w:r>
-        <w:t>1. Consolidación de tracking (bloqueante para medir cualquier resultado)</w:t>
+        <w:t>1. Corrección de conversiones (impacto inmediato, sin desarrollo)</w:t>
       </w:r>
     </w:p>
     <w:tbl>
@@ -161,6 +161,247 @@
           </w:tcPr>
           <w:p>
             <w:r>
+              <w:t>Marcar form_submit_fiscalizacion_tributaria_cit como evento clave (conversión) en GA4</w:t>
+            </w:r>
+          </w:p>
+        </w:tc>
+        <w:tc>
+          <w:tcPr>
+            <w:tcW w:type="dxa" w:w="1234"/>
+          </w:tcPr>
+          <w:p>
+            <w:r>
+              <w:t>Tarea</w:t>
+            </w:r>
+          </w:p>
+        </w:tc>
+        <w:tc>
+          <w:tcPr>
+            <w:tcW w:type="dxa" w:w="1234"/>
+          </w:tcPr>
+          <w:p>
+            <w:r>
+              <w:t>Agencia-prestador</w:t>
+            </w:r>
+          </w:p>
+        </w:tc>
+        <w:tc>
+          <w:tcPr>
+            <w:tcW w:type="dxa" w:w="1234"/>
+          </w:tcPr>
+          <w:p>
+            <w:r>
+              <w:t>Alto</w:t>
+            </w:r>
+          </w:p>
+        </w:tc>
+        <w:tc>
+          <w:tcPr>
+            <w:tcW w:type="dxa" w:w="1234"/>
+          </w:tcPr>
+          <w:p>
+            <w:r>
+              <w:t>15 min</w:t>
+            </w:r>
+          </w:p>
+        </w:tc>
+        <w:tc>
+          <w:tcPr>
+            <w:tcW w:type="dxa" w:w="1234"/>
+          </w:tcPr>
+          <w:p>
+            <w:r>
+              <w:t>Confirmado: 19 eventos en 30 días, 0 marcados como conversión, mientras que los otros 2 form_submit sí lo están</w:t>
+            </w:r>
+          </w:p>
+        </w:tc>
+      </w:tr>
+      <w:tr>
+        <w:tc>
+          <w:tcPr>
+            <w:tcW w:type="dxa" w:w="1234"/>
+          </w:tcPr>
+          <w:p>
+            <w:r>
+              <w:t>G2</w:t>
+            </w:r>
+          </w:p>
+        </w:tc>
+        <w:tc>
+          <w:tcPr>
+            <w:tcW w:type="dxa" w:w="1234"/>
+          </w:tcPr>
+          <w:p>
+            <w:r>
+              <w:t>Importar form_submit_fiscalizacion_tributaria_cit como conversión en Google Ads</w:t>
+            </w:r>
+          </w:p>
+        </w:tc>
+        <w:tc>
+          <w:tcPr>
+            <w:tcW w:type="dxa" w:w="1234"/>
+          </w:tcPr>
+          <w:p>
+            <w:r>
+              <w:t>Tarea</w:t>
+            </w:r>
+          </w:p>
+        </w:tc>
+        <w:tc>
+          <w:tcPr>
+            <w:tcW w:type="dxa" w:w="1234"/>
+          </w:tcPr>
+          <w:p>
+            <w:r>
+              <w:t>Agencia-prestador</w:t>
+            </w:r>
+          </w:p>
+        </w:tc>
+        <w:tc>
+          <w:tcPr>
+            <w:tcW w:type="dxa" w:w="1234"/>
+          </w:tcPr>
+          <w:p>
+            <w:r>
+              <w:t>Alto</w:t>
+            </w:r>
+          </w:p>
+        </w:tc>
+        <w:tc>
+          <w:tcPr>
+            <w:tcW w:type="dxa" w:w="1234"/>
+          </w:tcPr>
+          <w:p>
+            <w:r>
+              <w:t>15 min</w:t>
+            </w:r>
+          </w:p>
+        </w:tc>
+        <w:tc>
+          <w:tcPr>
+            <w:tcW w:type="dxa" w:w="1234"/>
+          </w:tcPr>
+          <w:p>
+            <w:r>
+              <w:t>Depende de G1</w:t>
+            </w:r>
+          </w:p>
+        </w:tc>
+      </w:tr>
+    </w:tbl>
+    <w:p/>
+    <w:p>
+      <w:pPr>
+        <w:pStyle w:val="Heading1"/>
+      </w:pPr>
+      <w:r>
+        <w:t>2. Tracking ausente (bloqueante para medir resultado)</w:t>
+      </w:r>
+    </w:p>
+    <w:tbl>
+      <w:tblPr>
+        <w:tblStyle w:val="LightGrid-Accent1"/>
+        <w:tblW w:type="auto" w:w="0"/>
+        <w:tblLook w:firstColumn="1" w:firstRow="1" w:lastColumn="0" w:lastRow="0" w:noHBand="0" w:noVBand="1" w:val="04A0"/>
+      </w:tblPr>
+      <w:tblGrid>
+        <w:gridCol w:w="1234"/>
+        <w:gridCol w:w="1234"/>
+        <w:gridCol w:w="1234"/>
+        <w:gridCol w:w="1234"/>
+        <w:gridCol w:w="1234"/>
+        <w:gridCol w:w="1234"/>
+        <w:gridCol w:w="1234"/>
+      </w:tblGrid>
+      <w:tr>
+        <w:tc>
+          <w:tcPr>
+            <w:tcW w:type="dxa" w:w="1234"/>
+          </w:tcPr>
+          <w:p>
+            <w:r>
+              <w:t>#</w:t>
+            </w:r>
+          </w:p>
+        </w:tc>
+        <w:tc>
+          <w:tcPr>
+            <w:tcW w:type="dxa" w:w="1234"/>
+          </w:tcPr>
+          <w:p>
+            <w:r>
+              <w:t>Tarea / Activo</w:t>
+            </w:r>
+          </w:p>
+        </w:tc>
+        <w:tc>
+          <w:tcPr>
+            <w:tcW w:type="dxa" w:w="1234"/>
+          </w:tcPr>
+          <w:p>
+            <w:r>
+              <w:t>Tipo</w:t>
+            </w:r>
+          </w:p>
+        </w:tc>
+        <w:tc>
+          <w:tcPr>
+            <w:tcW w:type="dxa" w:w="1234"/>
+          </w:tcPr>
+          <w:p>
+            <w:r>
+              <w:t>Responsable</w:t>
+            </w:r>
+          </w:p>
+        </w:tc>
+        <w:tc>
+          <w:tcPr>
+            <w:tcW w:type="dxa" w:w="1234"/>
+          </w:tcPr>
+          <w:p>
+            <w:r>
+              <w:t>Impacto</w:t>
+            </w:r>
+          </w:p>
+        </w:tc>
+        <w:tc>
+          <w:tcPr>
+            <w:tcW w:type="dxa" w:w="1234"/>
+          </w:tcPr>
+          <w:p>
+            <w:r>
+              <w:t>Tiempo estimado</w:t>
+            </w:r>
+          </w:p>
+        </w:tc>
+        <w:tc>
+          <w:tcPr>
+            <w:tcW w:type="dxa" w:w="1234"/>
+          </w:tcPr>
+          <w:p>
+            <w:r>
+              <w:t>Notas / criterios de aceptación</w:t>
+            </w:r>
+          </w:p>
+        </w:tc>
+      </w:tr>
+      <w:tr>
+        <w:tc>
+          <w:tcPr>
+            <w:tcW w:type="dxa" w:w="1234"/>
+          </w:tcPr>
+          <w:p>
+            <w:r>
+              <w:t>G3</w:t>
+            </w:r>
+          </w:p>
+        </w:tc>
+        <w:tc>
+          <w:tcPr>
+            <w:tcW w:type="dxa" w:w="1234"/>
+          </w:tcPr>
+          <w:p>
+            <w:r>
               <w:t>Instalar Google Tag Manager + tag de configuración GA4 en diagnostico.defensordelcontribuyente.cl</w:t>
             </w:r>
           </w:p>
@@ -211,151 +452,7 @@
           </w:tcPr>
           <w:p>
             <w:r>
-              <w:t>Confirmado: 0 contenedores GTM en esta herramienta. Es el formulario de mayor intención del ecosistema y hoy no genera ni un evento en GA4</w:t>
-            </w:r>
-          </w:p>
-        </w:tc>
-      </w:tr>
-      <w:tr>
-        <w:tc>
-          <w:tcPr>
-            <w:tcW w:type="dxa" w:w="1234"/>
-          </w:tcPr>
-          <w:p>
-            <w:r>
-              <w:t>G2</w:t>
-            </w:r>
-          </w:p>
-        </w:tc>
-        <w:tc>
-          <w:tcPr>
-            <w:tcW w:type="dxa" w:w="1234"/>
-          </w:tcPr>
-          <w:p>
-            <w:r>
-              <w:t>Eliminar uno de los dos contenedores GTM duplicados (GTM-N7BQZZW / GTM-MQC692WV) en las 8 URL del dominio principal</w:t>
-            </w:r>
-          </w:p>
-        </w:tc>
-        <w:tc>
-          <w:tcPr>
-            <w:tcW w:type="dxa" w:w="1234"/>
-          </w:tcPr>
-          <w:p>
-            <w:r>
-              <w:t>Tarea</w:t>
-            </w:r>
-          </w:p>
-        </w:tc>
-        <w:tc>
-          <w:tcPr>
-            <w:tcW w:type="dxa" w:w="1234"/>
-          </w:tcPr>
-          <w:p>
-            <w:r>
-              <w:t>Agencia-prestador</w:t>
-            </w:r>
-          </w:p>
-        </w:tc>
-        <w:tc>
-          <w:tcPr>
-            <w:tcW w:type="dxa" w:w="1234"/>
-          </w:tcPr>
-          <w:p>
-            <w:r>
-              <w:t>Alto</w:t>
-            </w:r>
-          </w:p>
-        </w:tc>
-        <w:tc>
-          <w:tcPr>
-            <w:tcW w:type="dxa" w:w="1234"/>
-          </w:tcPr>
-          <w:p>
-            <w:r>
-              <w:t>1-2 horas</w:t>
-            </w:r>
-          </w:p>
-        </w:tc>
-        <w:tc>
-          <w:tcPr>
-            <w:tcW w:type="dxa" w:w="1234"/>
-          </w:tcPr>
-          <w:p>
-            <w:r>
-              <w:t>Confirmado en la auditoría de 14 URL. Mientras ambos estén activos, cualquier evento de GA4 disparado desde GTM puede estar duplicándose</w:t>
-            </w:r>
-          </w:p>
-        </w:tc>
-      </w:tr>
-      <w:tr>
-        <w:tc>
-          <w:tcPr>
-            <w:tcW w:type="dxa" w:w="1234"/>
-          </w:tcPr>
-          <w:p>
-            <w:r>
-              <w:t>G3 🔒</w:t>
-            </w:r>
-          </w:p>
-        </w:tc>
-        <w:tc>
-          <w:tcPr>
-            <w:tcW w:type="dxa" w:w="1234"/>
-          </w:tcPr>
-          <w:p>
-            <w:r>
-              <w:t>Verificar, tras G2, que el tag de configuración GA4 no quede disparando dos veces por página</w:t>
-            </w:r>
-          </w:p>
-        </w:tc>
-        <w:tc>
-          <w:tcPr>
-            <w:tcW w:type="dxa" w:w="1234"/>
-          </w:tcPr>
-          <w:p>
-            <w:r>
-              <w:t>Tarea</w:t>
-            </w:r>
-          </w:p>
-        </w:tc>
-        <w:tc>
-          <w:tcPr>
-            <w:tcW w:type="dxa" w:w="1234"/>
-          </w:tcPr>
-          <w:p>
-            <w:r>
-              <w:t>Agencia-prestador</w:t>
-            </w:r>
-          </w:p>
-        </w:tc>
-        <w:tc>
-          <w:tcPr>
-            <w:tcW w:type="dxa" w:w="1234"/>
-          </w:tcPr>
-          <w:p>
-            <w:r>
-              <w:t>Alto</w:t>
-            </w:r>
-          </w:p>
-        </w:tc>
-        <w:tc>
-          <w:tcPr>
-            <w:tcW w:type="dxa" w:w="1234"/>
-          </w:tcPr>
-          <w:p>
-            <w:r>
-              <w:t>30 min</w:t>
-            </w:r>
-          </w:p>
-        </w:tc>
-        <w:tc>
-          <w:tcPr>
-            <w:tcW w:type="dxa" w:w="1234"/>
-          </w:tcPr>
-          <w:p>
-            <w:r>
-              <w:t>Criterio de aceptación: en DebugView, un page_view por carga de página, no dos</w:t>
+              <w:t>Confirmado: no existe ninguna propiedad GA4 para este subdominio</w:t>
             </w:r>
           </w:p>
         </w:tc>
@@ -377,79 +474,7 @@
           </w:tcPr>
           <w:p>
             <w:r>
-              <w:t>Confirmar cuántos Measurement ID de GA4 (G-XXXXXXX) están en uso hoy y en qué subdominios</w:t>
-            </w:r>
-          </w:p>
-        </w:tc>
-        <w:tc>
-          <w:tcPr>
-            <w:tcW w:type="dxa" w:w="1234"/>
-          </w:tcPr>
-          <w:p>
-            <w:r>
-              <w:t>Tarea</w:t>
-            </w:r>
-          </w:p>
-        </w:tc>
-        <w:tc>
-          <w:tcPr>
-            <w:tcW w:type="dxa" w:w="1234"/>
-          </w:tcPr>
-          <w:p>
-            <w:r>
-              <w:t>Agencia-prestador</w:t>
-            </w:r>
-          </w:p>
-        </w:tc>
-        <w:tc>
-          <w:tcPr>
-            <w:tcW w:type="dxa" w:w="1234"/>
-          </w:tcPr>
-          <w:p>
-            <w:r>
-              <w:t>Alto</w:t>
-            </w:r>
-          </w:p>
-        </w:tc>
-        <w:tc>
-          <w:tcPr>
-            <w:tcW w:type="dxa" w:w="1234"/>
-          </w:tcPr>
-          <w:p>
-            <w:r>
-              <w:t>1 hora</w:t>
-            </w:r>
-          </w:p>
-        </w:tc>
-        <w:tc>
-          <w:tcPr>
-            <w:tcW w:type="dxa" w:w="1234"/>
-          </w:tcPr>
-          <w:p>
-            <w:r>
-              <w:t>Tres instalaciones WordPress independientes — riesgo de config GA4 sin coordinar</w:t>
-            </w:r>
-          </w:p>
-        </w:tc>
-      </w:tr>
-      <w:tr>
-        <w:tc>
-          <w:tcPr>
-            <w:tcW w:type="dxa" w:w="1234"/>
-          </w:tcPr>
-          <w:p>
-            <w:r>
-              <w:t>G5</w:t>
-            </w:r>
-          </w:p>
-        </w:tc>
-        <w:tc>
-          <w:tcPr>
-            <w:tcW w:type="dxa" w:w="1234"/>
-          </w:tcPr>
-          <w:p>
-            <w:r>
-              <w:t>Configurar cross-domain measurement entre defensordelcontribuyente.cl, servicios. y diagnostico.</w:t>
+              <w:t>Instrumentar eventos form_start / form_submit_* / click en la propiedad GA4 de servicios.</w:t>
             </w:r>
           </w:p>
         </w:tc>
@@ -499,7 +524,79 @@
           </w:tcPr>
           <w:p>
             <w:r>
-              <w:t>Sin esto, cruzar de subdominio cuenta como sesión nueva y se pierde el recorrido real hasta la conversión</w:t>
+              <w:t>Confirmado: solo registra eventos automáticos, cero eventos personalizados pese a formularios reales</w:t>
+            </w:r>
+          </w:p>
+        </w:tc>
+      </w:tr>
+      <w:tr>
+        <w:tc>
+          <w:tcPr>
+            <w:tcW w:type="dxa" w:w="1234"/>
+          </w:tcPr>
+          <w:p>
+            <w:r>
+              <w:t>G5</w:t>
+            </w:r>
+          </w:p>
+        </w:tc>
+        <w:tc>
+          <w:tcPr>
+            <w:tcW w:type="dxa" w:w="1234"/>
+          </w:tcPr>
+          <w:p>
+            <w:r>
+              <w:t>Instrumentar eventos distintos para clics a WhatsApp y a teléfono</w:t>
+            </w:r>
+          </w:p>
+        </w:tc>
+        <w:tc>
+          <w:tcPr>
+            <w:tcW w:type="dxa" w:w="1234"/>
+          </w:tcPr>
+          <w:p>
+            <w:r>
+              <w:t>Tarea</w:t>
+            </w:r>
+          </w:p>
+        </w:tc>
+        <w:tc>
+          <w:tcPr>
+            <w:tcW w:type="dxa" w:w="1234"/>
+          </w:tcPr>
+          <w:p>
+            <w:r>
+              <w:t>Agencia-prestador</w:t>
+            </w:r>
+          </w:p>
+        </w:tc>
+        <w:tc>
+          <w:tcPr>
+            <w:tcW w:type="dxa" w:w="1234"/>
+          </w:tcPr>
+          <w:p>
+            <w:r>
+              <w:t>Medio</w:t>
+            </w:r>
+          </w:p>
+        </w:tc>
+        <w:tc>
+          <w:tcPr>
+            <w:tcW w:type="dxa" w:w="1234"/>
+          </w:tcPr>
+          <w:p>
+            <w:r>
+              <w:t>1-2 horas</w:t>
+            </w:r>
+          </w:p>
+        </w:tc>
+        <w:tc>
+          <w:tcPr>
+            <w:tcW w:type="dxa" w:w="1234"/>
+          </w:tcPr>
+          <w:p>
+            <w:r>
+              <w:t>Hoy existe un único evento genérico click (33/30d) sin desglose por destino</w:t>
             </w:r>
           </w:p>
         </w:tc>
@@ -511,7 +608,7 @@
         <w:pStyle w:val="Heading1"/>
       </w:pPr>
       <w:r>
-        <w:t>2. Eventos de conversión</w:t>
+        <w:t>3. Configuración de propiedad</w:t>
       </w:r>
     </w:p>
     <w:tbl>
@@ -618,7 +715,320 @@
           </w:tcPr>
           <w:p>
             <w:r>
-              <w:t>Marcar como conversión en GA4 el envío de formulario en páginas de servicio, FAQ y diagnóstico</w:t>
+              <w:t>Corregir moneda de la propiedad servicios. (hoy USD) a CLP</w:t>
+            </w:r>
+          </w:p>
+        </w:tc>
+        <w:tc>
+          <w:tcPr>
+            <w:tcW w:type="dxa" w:w="1234"/>
+          </w:tcPr>
+          <w:p>
+            <w:r>
+              <w:t>Tarea</w:t>
+            </w:r>
+          </w:p>
+        </w:tc>
+        <w:tc>
+          <w:tcPr>
+            <w:tcW w:type="dxa" w:w="1234"/>
+          </w:tcPr>
+          <w:p>
+            <w:r>
+              <w:t>Agencia-prestador</w:t>
+            </w:r>
+          </w:p>
+        </w:tc>
+        <w:tc>
+          <w:tcPr>
+            <w:tcW w:type="dxa" w:w="1234"/>
+          </w:tcPr>
+          <w:p>
+            <w:r>
+              <w:t>Medio</w:t>
+            </w:r>
+          </w:p>
+        </w:tc>
+        <w:tc>
+          <w:tcPr>
+            <w:tcW w:type="dxa" w:w="1234"/>
+          </w:tcPr>
+          <w:p>
+            <w:r>
+              <w:t>15 min</w:t>
+            </w:r>
+          </w:p>
+        </w:tc>
+        <w:tc>
+          <w:tcPr>
+            <w:tcW w:type="dxa" w:w="1234"/>
+          </w:tcPr>
+          <w:p>
+            <w:r>
+              <w:t>El dominio principal ya está en CLP</w:t>
+            </w:r>
+          </w:p>
+        </w:tc>
+      </w:tr>
+      <w:tr>
+        <w:tc>
+          <w:tcPr>
+            <w:tcW w:type="dxa" w:w="1234"/>
+          </w:tcPr>
+          <w:p>
+            <w:r>
+              <w:t>G7</w:t>
+            </w:r>
+          </w:p>
+        </w:tc>
+        <w:tc>
+          <w:tcPr>
+            <w:tcW w:type="dxa" w:w="1234"/>
+          </w:tcPr>
+          <w:p>
+            <w:r>
+              <w:t>Definir categoría de industria en la propiedad servicios. (hoy sin especificar)</w:t>
+            </w:r>
+          </w:p>
+        </w:tc>
+        <w:tc>
+          <w:tcPr>
+            <w:tcW w:type="dxa" w:w="1234"/>
+          </w:tcPr>
+          <w:p>
+            <w:r>
+              <w:t>Tarea</w:t>
+            </w:r>
+          </w:p>
+        </w:tc>
+        <w:tc>
+          <w:tcPr>
+            <w:tcW w:type="dxa" w:w="1234"/>
+          </w:tcPr>
+          <w:p>
+            <w:r>
+              <w:t>Agencia-prestador</w:t>
+            </w:r>
+          </w:p>
+        </w:tc>
+        <w:tc>
+          <w:tcPr>
+            <w:tcW w:type="dxa" w:w="1234"/>
+          </w:tcPr>
+          <w:p>
+            <w:r>
+              <w:t>Bajo</w:t>
+            </w:r>
+          </w:p>
+        </w:tc>
+        <w:tc>
+          <w:tcPr>
+            <w:tcW w:type="dxa" w:w="1234"/>
+          </w:tcPr>
+          <w:p>
+            <w:r>
+              <w:t>15 min</w:t>
+            </w:r>
+          </w:p>
+        </w:tc>
+        <w:tc>
+          <w:tcPr>
+            <w:tcW w:type="dxa" w:w="1234"/>
+          </w:tcPr>
+          <w:p>
+            <w:r>
+              <w:t>El dominio principal tiene OTHER</w:t>
+            </w:r>
+          </w:p>
+        </w:tc>
+      </w:tr>
+      <w:tr>
+        <w:tc>
+          <w:tcPr>
+            <w:tcW w:type="dxa" w:w="1234"/>
+          </w:tcPr>
+          <w:p>
+            <w:r>
+              <w:t>G8</w:t>
+            </w:r>
+          </w:p>
+        </w:tc>
+        <w:tc>
+          <w:tcPr>
+            <w:tcW w:type="dxa" w:w="1234"/>
+          </w:tcPr>
+          <w:p>
+            <w:r>
+              <w:t>Decidir si servicios. sigue siendo propiedad separada o se consolida</w:t>
+            </w:r>
+          </w:p>
+        </w:tc>
+        <w:tc>
+          <w:tcPr>
+            <w:tcW w:type="dxa" w:w="1234"/>
+          </w:tcPr>
+          <w:p>
+            <w:r>
+              <w:t>Tarea</w:t>
+            </w:r>
+          </w:p>
+        </w:tc>
+        <w:tc>
+          <w:tcPr>
+            <w:tcW w:type="dxa" w:w="1234"/>
+          </w:tcPr>
+          <w:p>
+            <w:r>
+              <w:t>Cliente-Estudio decide · Agencia ejecuta</w:t>
+            </w:r>
+          </w:p>
+        </w:tc>
+        <w:tc>
+          <w:tcPr>
+            <w:tcW w:type="dxa" w:w="1234"/>
+          </w:tcPr>
+          <w:p>
+            <w:r>
+              <w:t>Alto</w:t>
+            </w:r>
+          </w:p>
+        </w:tc>
+        <w:tc>
+          <w:tcPr>
+            <w:tcW w:type="dxa" w:w="1234"/>
+          </w:tcPr>
+          <w:p>
+            <w:r>
+              <w:t>1 reunión</w:t>
+            </w:r>
+          </w:p>
+        </w:tc>
+        <w:tc>
+          <w:tcPr>
+            <w:tcW w:type="dxa" w:w="1234"/>
+          </w:tcPr>
+          <w:p>
+            <w:r>
+              <w:t>12 sesiones/30 días y cero eventos personalizados — definir antes de invertir en G4</w:t>
+            </w:r>
+          </w:p>
+        </w:tc>
+      </w:tr>
+    </w:tbl>
+    <w:p/>
+    <w:p>
+      <w:pPr>
+        <w:pStyle w:val="Heading1"/>
+      </w:pPr>
+      <w:r>
+        <w:t>4. Cross-domain y arquitectura de medición</w:t>
+      </w:r>
+    </w:p>
+    <w:tbl>
+      <w:tblPr>
+        <w:tblStyle w:val="LightGrid-Accent1"/>
+        <w:tblW w:type="auto" w:w="0"/>
+        <w:tblLook w:firstColumn="1" w:firstRow="1" w:lastColumn="0" w:lastRow="0" w:noHBand="0" w:noVBand="1" w:val="04A0"/>
+      </w:tblPr>
+      <w:tblGrid>
+        <w:gridCol w:w="1234"/>
+        <w:gridCol w:w="1234"/>
+        <w:gridCol w:w="1234"/>
+        <w:gridCol w:w="1234"/>
+        <w:gridCol w:w="1234"/>
+        <w:gridCol w:w="1234"/>
+        <w:gridCol w:w="1234"/>
+      </w:tblGrid>
+      <w:tr>
+        <w:tc>
+          <w:tcPr>
+            <w:tcW w:type="dxa" w:w="1234"/>
+          </w:tcPr>
+          <w:p>
+            <w:r>
+              <w:t>#</w:t>
+            </w:r>
+          </w:p>
+        </w:tc>
+        <w:tc>
+          <w:tcPr>
+            <w:tcW w:type="dxa" w:w="1234"/>
+          </w:tcPr>
+          <w:p>
+            <w:r>
+              <w:t>Tarea / Activo</w:t>
+            </w:r>
+          </w:p>
+        </w:tc>
+        <w:tc>
+          <w:tcPr>
+            <w:tcW w:type="dxa" w:w="1234"/>
+          </w:tcPr>
+          <w:p>
+            <w:r>
+              <w:t>Tipo</w:t>
+            </w:r>
+          </w:p>
+        </w:tc>
+        <w:tc>
+          <w:tcPr>
+            <w:tcW w:type="dxa" w:w="1234"/>
+          </w:tcPr>
+          <w:p>
+            <w:r>
+              <w:t>Responsable</w:t>
+            </w:r>
+          </w:p>
+        </w:tc>
+        <w:tc>
+          <w:tcPr>
+            <w:tcW w:type="dxa" w:w="1234"/>
+          </w:tcPr>
+          <w:p>
+            <w:r>
+              <w:t>Impacto</w:t>
+            </w:r>
+          </w:p>
+        </w:tc>
+        <w:tc>
+          <w:tcPr>
+            <w:tcW w:type="dxa" w:w="1234"/>
+          </w:tcPr>
+          <w:p>
+            <w:r>
+              <w:t>Tiempo estimado</w:t>
+            </w:r>
+          </w:p>
+        </w:tc>
+        <w:tc>
+          <w:tcPr>
+            <w:tcW w:type="dxa" w:w="1234"/>
+          </w:tcPr>
+          <w:p>
+            <w:r>
+              <w:t>Notas / criterios de aceptación</w:t>
+            </w:r>
+          </w:p>
+        </w:tc>
+      </w:tr>
+      <w:tr>
+        <w:tc>
+          <w:tcPr>
+            <w:tcW w:type="dxa" w:w="1234"/>
+          </w:tcPr>
+          <w:p>
+            <w:r>
+              <w:t>G9</w:t>
+            </w:r>
+          </w:p>
+        </w:tc>
+        <w:tc>
+          <w:tcPr>
+            <w:tcW w:type="dxa" w:w="1234"/>
+          </w:tcPr>
+          <w:p>
+            <w:r>
+              <w:t>Configurar cross-domain measurement o rollup entre dominio principal y servicios. (si G8 mantiene ambas)</w:t>
             </w:r>
           </w:p>
         </w:tc>
@@ -658,7 +1068,7 @@
           </w:tcPr>
           <w:p>
             <w:r>
-              <w:t>1-2 horas</w:t>
+              <w:t>2-3 horas</w:t>
             </w:r>
           </w:p>
         </w:tc>
@@ -668,223 +1078,7 @@
           </w:tcPr>
           <w:p>
             <w:r>
-              <w:t>Depende de G1 para diagnostico.</w:t>
-            </w:r>
-          </w:p>
-        </w:tc>
-      </w:tr>
-      <w:tr>
-        <w:tc>
-          <w:tcPr>
-            <w:tcW w:type="dxa" w:w="1234"/>
-          </w:tcPr>
-          <w:p>
-            <w:r>
-              <w:t>G7</w:t>
-            </w:r>
-          </w:p>
-        </w:tc>
-        <w:tc>
-          <w:tcPr>
-            <w:tcW w:type="dxa" w:w="1234"/>
-          </w:tcPr>
-          <w:p>
-            <w:r>
-              <w:t>Marcar como conversión los clics a WhatsApp (8 de 14 URL auditadas) y a teléfono</w:t>
-            </w:r>
-          </w:p>
-        </w:tc>
-        <w:tc>
-          <w:tcPr>
-            <w:tcW w:type="dxa" w:w="1234"/>
-          </w:tcPr>
-          <w:p>
-            <w:r>
-              <w:t>Tarea</w:t>
-            </w:r>
-          </w:p>
-        </w:tc>
-        <w:tc>
-          <w:tcPr>
-            <w:tcW w:type="dxa" w:w="1234"/>
-          </w:tcPr>
-          <w:p>
-            <w:r>
-              <w:t>Agencia-prestador</w:t>
-            </w:r>
-          </w:p>
-        </w:tc>
-        <w:tc>
-          <w:tcPr>
-            <w:tcW w:type="dxa" w:w="1234"/>
-          </w:tcPr>
-          <w:p>
-            <w:r>
-              <w:t>Alto</w:t>
-            </w:r>
-          </w:p>
-        </w:tc>
-        <w:tc>
-          <w:tcPr>
-            <w:tcW w:type="dxa" w:w="1234"/>
-          </w:tcPr>
-          <w:p>
-            <w:r>
-              <w:t>1 hora</w:t>
-            </w:r>
-          </w:p>
-        </w:tc>
-        <w:tc>
-          <w:tcPr>
-            <w:tcW w:type="dxa" w:w="1234"/>
-          </w:tcPr>
-          <w:p>
-            <w:r>
-              <w:t>Confirmar que el clic dispara un evento medible, no solo un enlace sin tracking</w:t>
-            </w:r>
-          </w:p>
-        </w:tc>
-      </w:tr>
-      <w:tr>
-        <w:tc>
-          <w:tcPr>
-            <w:tcW w:type="dxa" w:w="1234"/>
-          </w:tcPr>
-          <w:p>
-            <w:r>
-              <w:t>G8</w:t>
-            </w:r>
-          </w:p>
-        </w:tc>
-        <w:tc>
-          <w:tcPr>
-            <w:tcW w:type="dxa" w:w="1234"/>
-          </w:tcPr>
-          <w:p>
-            <w:r>
-              <w:t>Definir junto al equipo qué cuenta como "lead calificado"</w:t>
-            </w:r>
-          </w:p>
-        </w:tc>
-        <w:tc>
-          <w:tcPr>
-            <w:tcW w:type="dxa" w:w="1234"/>
-          </w:tcPr>
-          <w:p>
-            <w:r>
-              <w:t>Tarea</w:t>
-            </w:r>
-          </w:p>
-        </w:tc>
-        <w:tc>
-          <w:tcPr>
-            <w:tcW w:type="dxa" w:w="1234"/>
-          </w:tcPr>
-          <w:p>
-            <w:r>
-              <w:t>Cliente-Estudio</w:t>
-            </w:r>
-          </w:p>
-        </w:tc>
-        <w:tc>
-          <w:tcPr>
-            <w:tcW w:type="dxa" w:w="1234"/>
-          </w:tcPr>
-          <w:p>
-            <w:r>
-              <w:t>Alto</w:t>
-            </w:r>
-          </w:p>
-        </w:tc>
-        <w:tc>
-          <w:tcPr>
-            <w:tcW w:type="dxa" w:w="1234"/>
-          </w:tcPr>
-          <w:p>
-            <w:r>
-              <w:t>1 reunión (1 hora)</w:t>
-            </w:r>
-          </w:p>
-        </w:tc>
-        <w:tc>
-          <w:tcPr>
-            <w:tcW w:type="dxa" w:w="1234"/>
-          </w:tcPr>
-          <w:p>
-            <w:r>
-              <w:t>Insumo obligatorio para G9</w:t>
-            </w:r>
-          </w:p>
-        </w:tc>
-      </w:tr>
-      <w:tr>
-        <w:tc>
-          <w:tcPr>
-            <w:tcW w:type="dxa" w:w="1234"/>
-          </w:tcPr>
-          <w:p>
-            <w:r>
-              <w:t>G9</w:t>
-            </w:r>
-          </w:p>
-        </w:tc>
-        <w:tc>
-          <w:tcPr>
-            <w:tcW w:type="dxa" w:w="1234"/>
-          </w:tcPr>
-          <w:p>
-            <w:r>
-              <w:t>Configurar el evento de "lead calificado" (G8) como conversión clave en GA4</w:t>
-            </w:r>
-          </w:p>
-        </w:tc>
-        <w:tc>
-          <w:tcPr>
-            <w:tcW w:type="dxa" w:w="1234"/>
-          </w:tcPr>
-          <w:p>
-            <w:r>
-              <w:t>Tarea</w:t>
-            </w:r>
-          </w:p>
-        </w:tc>
-        <w:tc>
-          <w:tcPr>
-            <w:tcW w:type="dxa" w:w="1234"/>
-          </w:tcPr>
-          <w:p>
-            <w:r>
-              <w:t>Agencia-prestador</w:t>
-            </w:r>
-          </w:p>
-        </w:tc>
-        <w:tc>
-          <w:tcPr>
-            <w:tcW w:type="dxa" w:w="1234"/>
-          </w:tcPr>
-          <w:p>
-            <w:r>
-              <w:t>Alto</w:t>
-            </w:r>
-          </w:p>
-        </w:tc>
-        <w:tc>
-          <w:tcPr>
-            <w:tcW w:type="dxa" w:w="1234"/>
-          </w:tcPr>
-          <w:p>
-            <w:r>
-              <w:t>1-2 horas</w:t>
-            </w:r>
-          </w:p>
-        </w:tc>
-        <w:tc>
-          <w:tcPr>
-            <w:tcW w:type="dxa" w:w="1234"/>
-          </w:tcPr>
-          <w:p>
-            <w:r>
-              <w:t>Depende de G8</w:t>
+              <w:t>Confirmado: 2 propiedades GA4 sin relación entre sí</w:t>
             </w:r>
           </w:p>
         </w:tc>
@@ -896,7 +1090,7 @@
         <w:pStyle w:val="Heading1"/>
       </w:pPr>
       <w:r>
-        <w:t>3. Vinculación con Google Ads y otras herramientas</w:t>
+        <w:t>5. Experiencia de conversión</w:t>
       </w:r>
     </w:p>
     <w:tbl>
@@ -1003,7 +1197,7 @@
           </w:tcPr>
           <w:p>
             <w:r>
-              <w:t>Vincular la propiedad GA4 con la cuenta de Google Ads (AW-593050363)</w:t>
+              <w:t>Investigar por qué el 57% de quienes inician un formulario no lo terminan (141 form_start vs 61 form_submit en 30 días)</w:t>
             </w:r>
           </w:p>
         </w:tc>
@@ -1023,7 +1217,7 @@
           </w:tcPr>
           <w:p>
             <w:r>
-              <w:t>Agencia-prestador</w:t>
+              <w:t>Cliente-Estudio + Agencia</w:t>
             </w:r>
           </w:p>
         </w:tc>
@@ -1043,7 +1237,7 @@
           </w:tcPr>
           <w:p>
             <w:r>
-              <w:t>30 min</w:t>
+              <w:t>1-2 horas + ajustes</w:t>
             </w:r>
           </w:p>
         </w:tc>
@@ -1053,151 +1247,7 @@
           </w:tcPr>
           <w:p>
             <w:r>
-              <w:t>Habilita que conversiones reales de GA4 alimenten la optimización de campañas</w:t>
-            </w:r>
-          </w:p>
-        </w:tc>
-      </w:tr>
-      <w:tr>
-        <w:tc>
-          <w:tcPr>
-            <w:tcW w:type="dxa" w:w="1234"/>
-          </w:tcPr>
-          <w:p>
-            <w:r>
-              <w:t>G11</w:t>
-            </w:r>
-          </w:p>
-        </w:tc>
-        <w:tc>
-          <w:tcPr>
-            <w:tcW w:type="dxa" w:w="1234"/>
-          </w:tcPr>
-          <w:p>
-            <w:r>
-              <w:t>Importar como conversión de Google Ads los eventos definidos en G6/G7/G9</w:t>
-            </w:r>
-          </w:p>
-        </w:tc>
-        <w:tc>
-          <w:tcPr>
-            <w:tcW w:type="dxa" w:w="1234"/>
-          </w:tcPr>
-          <w:p>
-            <w:r>
-              <w:t>Tarea</w:t>
-            </w:r>
-          </w:p>
-        </w:tc>
-        <w:tc>
-          <w:tcPr>
-            <w:tcW w:type="dxa" w:w="1234"/>
-          </w:tcPr>
-          <w:p>
-            <w:r>
-              <w:t>Agencia-prestador</w:t>
-            </w:r>
-          </w:p>
-        </w:tc>
-        <w:tc>
-          <w:tcPr>
-            <w:tcW w:type="dxa" w:w="1234"/>
-          </w:tcPr>
-          <w:p>
-            <w:r>
-              <w:t>Alto</w:t>
-            </w:r>
-          </w:p>
-        </w:tc>
-        <w:tc>
-          <w:tcPr>
-            <w:tcW w:type="dxa" w:w="1234"/>
-          </w:tcPr>
-          <w:p>
-            <w:r>
-              <w:t>1 hora</w:t>
-            </w:r>
-          </w:p>
-        </w:tc>
-        <w:tc>
-          <w:tcPr>
-            <w:tcW w:type="dxa" w:w="1234"/>
-          </w:tcPr>
-          <w:p>
-            <w:r>
-              <w:t>Depende de G10</w:t>
-            </w:r>
-          </w:p>
-        </w:tc>
-      </w:tr>
-      <w:tr>
-        <w:tc>
-          <w:tcPr>
-            <w:tcW w:type="dxa" w:w="1234"/>
-          </w:tcPr>
-          <w:p>
-            <w:r>
-              <w:t>G12</w:t>
-            </w:r>
-          </w:p>
-        </w:tc>
-        <w:tc>
-          <w:tcPr>
-            <w:tcW w:type="dxa" w:w="1234"/>
-          </w:tcPr>
-          <w:p>
-            <w:r>
-              <w:t>Evaluar instalación de Meta Pixel y vincular sus eventos con los mismos hitos de GA4</w:t>
-            </w:r>
-          </w:p>
-        </w:tc>
-        <w:tc>
-          <w:tcPr>
-            <w:tcW w:type="dxa" w:w="1234"/>
-          </w:tcPr>
-          <w:p>
-            <w:r>
-              <w:t>Tarea</w:t>
-            </w:r>
-          </w:p>
-        </w:tc>
-        <w:tc>
-          <w:tcPr>
-            <w:tcW w:type="dxa" w:w="1234"/>
-          </w:tcPr>
-          <w:p>
-            <w:r>
-              <w:t>Cliente-Estudio decide · Agencia implementa</w:t>
-            </w:r>
-          </w:p>
-        </w:tc>
-        <w:tc>
-          <w:tcPr>
-            <w:tcW w:type="dxa" w:w="1234"/>
-          </w:tcPr>
-          <w:p>
-            <w:r>
-              <w:t>Alto</w:t>
-            </w:r>
-          </w:p>
-        </w:tc>
-        <w:tc>
-          <w:tcPr>
-            <w:tcW w:type="dxa" w:w="1234"/>
-          </w:tcPr>
-          <w:p>
-            <w:r>
-              <w:t>2-3 horas</w:t>
-            </w:r>
-          </w:p>
-        </w:tc>
-        <w:tc>
-          <w:tcPr>
-            <w:tcW w:type="dxa" w:w="1234"/>
-          </w:tcPr>
-          <w:p>
-            <w:r>
-              <w:t>Meta Pixel ausente en las 14 URL auditadas. Bloqueante si se piensa pautar en Meta</w:t>
+              <w:t>Revisar antes de invertir más presupuesto en tráfico a ese formulario</w:t>
             </w:r>
           </w:p>
         </w:tc>
@@ -1209,483 +1259,17 @@
         <w:pStyle w:val="Heading1"/>
       </w:pPr>
       <w:r>
-        <w:t>4. Calidad de datos y medición mejorada</w:t>
+        <w:t>Tareas de la versión anterior ya confirmadas como completas</w:t>
       </w:r>
     </w:p>
-    <w:tbl>
-      <w:tblPr>
-        <w:tblStyle w:val="LightGrid-Accent1"/>
-        <w:tblW w:type="auto" w:w="0"/>
-        <w:tblLook w:firstColumn="1" w:firstRow="1" w:lastColumn="0" w:lastRow="0" w:noHBand="0" w:noVBand="1" w:val="04A0"/>
-      </w:tblPr>
-      <w:tblGrid>
-        <w:gridCol w:w="1234"/>
-        <w:gridCol w:w="1234"/>
-        <w:gridCol w:w="1234"/>
-        <w:gridCol w:w="1234"/>
-        <w:gridCol w:w="1234"/>
-        <w:gridCol w:w="1234"/>
-        <w:gridCol w:w="1234"/>
-      </w:tblGrid>
-      <w:tr>
-        <w:tc>
-          <w:tcPr>
-            <w:tcW w:type="dxa" w:w="1234"/>
-          </w:tcPr>
-          <w:p>
-            <w:r>
-              <w:t>#</w:t>
-            </w:r>
-          </w:p>
-        </w:tc>
-        <w:tc>
-          <w:tcPr>
-            <w:tcW w:type="dxa" w:w="1234"/>
-          </w:tcPr>
-          <w:p>
-            <w:r>
-              <w:t>Tarea / Activo</w:t>
-            </w:r>
-          </w:p>
-        </w:tc>
-        <w:tc>
-          <w:tcPr>
-            <w:tcW w:type="dxa" w:w="1234"/>
-          </w:tcPr>
-          <w:p>
-            <w:r>
-              <w:t>Tipo</w:t>
-            </w:r>
-          </w:p>
-        </w:tc>
-        <w:tc>
-          <w:tcPr>
-            <w:tcW w:type="dxa" w:w="1234"/>
-          </w:tcPr>
-          <w:p>
-            <w:r>
-              <w:t>Responsable</w:t>
-            </w:r>
-          </w:p>
-        </w:tc>
-        <w:tc>
-          <w:tcPr>
-            <w:tcW w:type="dxa" w:w="1234"/>
-          </w:tcPr>
-          <w:p>
-            <w:r>
-              <w:t>Impacto</w:t>
-            </w:r>
-          </w:p>
-        </w:tc>
-        <w:tc>
-          <w:tcPr>
-            <w:tcW w:type="dxa" w:w="1234"/>
-          </w:tcPr>
-          <w:p>
-            <w:r>
-              <w:t>Tiempo estimado</w:t>
-            </w:r>
-          </w:p>
-        </w:tc>
-        <w:tc>
-          <w:tcPr>
-            <w:tcW w:type="dxa" w:w="1234"/>
-          </w:tcPr>
-          <w:p>
-            <w:r>
-              <w:t>Notas / criterios de aceptación</w:t>
-            </w:r>
-          </w:p>
-        </w:tc>
-      </w:tr>
-      <w:tr>
-        <w:tc>
-          <w:tcPr>
-            <w:tcW w:type="dxa" w:w="1234"/>
-          </w:tcPr>
-          <w:p>
-            <w:r>
-              <w:t>G13</w:t>
-            </w:r>
-          </w:p>
-        </w:tc>
-        <w:tc>
-          <w:tcPr>
-            <w:tcW w:type="dxa" w:w="1234"/>
-          </w:tcPr>
-          <w:p>
-            <w:r>
-              <w:t>Revisar Enhanced Measurement (scroll, clics salientes, descargas, búsqueda en el sitio)</w:t>
-            </w:r>
-          </w:p>
-        </w:tc>
-        <w:tc>
-          <w:tcPr>
-            <w:tcW w:type="dxa" w:w="1234"/>
-          </w:tcPr>
-          <w:p>
-            <w:r>
-              <w:t>Tarea</w:t>
-            </w:r>
-          </w:p>
-        </w:tc>
-        <w:tc>
-          <w:tcPr>
-            <w:tcW w:type="dxa" w:w="1234"/>
-          </w:tcPr>
-          <w:p>
-            <w:r>
-              <w:t>Agencia-prestador</w:t>
-            </w:r>
-          </w:p>
-        </w:tc>
-        <w:tc>
-          <w:tcPr>
-            <w:tcW w:type="dxa" w:w="1234"/>
-          </w:tcPr>
-          <w:p>
-            <w:r>
-              <w:t>Medio</w:t>
-            </w:r>
-          </w:p>
-        </w:tc>
-        <w:tc>
-          <w:tcPr>
-            <w:tcW w:type="dxa" w:w="1234"/>
-          </w:tcPr>
-          <w:p>
-            <w:r>
-              <w:t>1 hora</w:t>
-            </w:r>
-          </w:p>
-        </w:tc>
-        <w:tc>
-          <w:tcPr>
-            <w:tcW w:type="dxa" w:w="1234"/>
-          </w:tcPr>
-          <w:p>
-            <w:r>
-              <w:t>Estándar de GA4, verificar que no quede desactivado</w:t>
-            </w:r>
-          </w:p>
-        </w:tc>
-      </w:tr>
-      <w:tr>
-        <w:tc>
-          <w:tcPr>
-            <w:tcW w:type="dxa" w:w="1234"/>
-          </w:tcPr>
-          <w:p>
-            <w:r>
-              <w:t>G14</w:t>
-            </w:r>
-          </w:p>
-        </w:tc>
-        <w:tc>
-          <w:tcPr>
-            <w:tcW w:type="dxa" w:w="1234"/>
-          </w:tcPr>
-          <w:p>
-            <w:r>
-              <w:t>Excluir tráfico interno (equipo del Estudio y agencia) de los reportes de GA4</w:t>
-            </w:r>
-          </w:p>
-        </w:tc>
-        <w:tc>
-          <w:tcPr>
-            <w:tcW w:type="dxa" w:w="1234"/>
-          </w:tcPr>
-          <w:p>
-            <w:r>
-              <w:t>Tarea</w:t>
-            </w:r>
-          </w:p>
-        </w:tc>
-        <w:tc>
-          <w:tcPr>
-            <w:tcW w:type="dxa" w:w="1234"/>
-          </w:tcPr>
-          <w:p>
-            <w:r>
-              <w:t>Agencia-prestador</w:t>
-            </w:r>
-          </w:p>
-        </w:tc>
-        <w:tc>
-          <w:tcPr>
-            <w:tcW w:type="dxa" w:w="1234"/>
-          </w:tcPr>
-          <w:p>
-            <w:r>
-              <w:t>Medio</w:t>
-            </w:r>
-          </w:p>
-        </w:tc>
-        <w:tc>
-          <w:tcPr>
-            <w:tcW w:type="dxa" w:w="1234"/>
-          </w:tcPr>
-          <w:p>
-            <w:r>
-              <w:t>30 min</w:t>
-            </w:r>
-          </w:p>
-        </w:tc>
-        <w:tc>
-          <w:tcPr>
-            <w:tcW w:type="dxa" w:w="1234"/>
-          </w:tcPr>
-          <w:p>
-            <w:r>
-              <w:t>Evita que pruebas internas infle métricas</w:t>
-            </w:r>
-          </w:p>
-        </w:tc>
-      </w:tr>
-      <w:tr>
-        <w:tc>
-          <w:tcPr>
-            <w:tcW w:type="dxa" w:w="1234"/>
-          </w:tcPr>
-          <w:p>
-            <w:r>
-              <w:t>G15</w:t>
-            </w:r>
-          </w:p>
-        </w:tc>
-        <w:tc>
-          <w:tcPr>
-            <w:tcW w:type="dxa" w:w="1234"/>
-          </w:tcPr>
-          <w:p>
-            <w:r>
-              <w:t>Configurar retención de datos y accesos de usuario en la propiedad GA4</w:t>
-            </w:r>
-          </w:p>
-        </w:tc>
-        <w:tc>
-          <w:tcPr>
-            <w:tcW w:type="dxa" w:w="1234"/>
-          </w:tcPr>
-          <w:p>
-            <w:r>
-              <w:t>Tarea</w:t>
-            </w:r>
-          </w:p>
-        </w:tc>
-        <w:tc>
-          <w:tcPr>
-            <w:tcW w:type="dxa" w:w="1234"/>
-          </w:tcPr>
-          <w:p>
-            <w:r>
-              <w:t>Cliente-Estudio define accesos · Agencia configura</w:t>
-            </w:r>
-          </w:p>
-        </w:tc>
-        <w:tc>
-          <w:tcPr>
-            <w:tcW w:type="dxa" w:w="1234"/>
-          </w:tcPr>
-          <w:p>
-            <w:r>
-              <w:t>Bajo</w:t>
-            </w:r>
-          </w:p>
-        </w:tc>
-        <w:tc>
-          <w:tcPr>
-            <w:tcW w:type="dxa" w:w="1234"/>
-          </w:tcPr>
-          <w:p>
-            <w:r>
-              <w:t>1 hora</w:t>
-            </w:r>
-          </w:p>
-        </w:tc>
-        <w:tc>
-          <w:tcPr>
-            <w:tcW w:type="dxa" w:w="1234"/>
-          </w:tcPr>
-          <w:p>
-            <w:r>
-              <w:t>Alinear con quién administra la cuenta tras el traspaso</w:t>
-            </w:r>
-          </w:p>
-        </w:tc>
-      </w:tr>
-    </w:tbl>
-    <w:p/>
     <w:p>
       <w:pPr>
-        <w:pStyle w:val="Heading1"/>
+        <w:pStyle w:val="ListBullet"/>
       </w:pPr>
       <w:r>
-        <w:t>5. Auditoría en vivo (pendiente de reinicio de sesión)</w:t>
+        <w:t>Vincular la propiedad GA4 con la cuenta de Google Ads — confirmado: ya está hecho en ambas propiedades (customer_id 8985279729, vinculado desde mayo 2025 por tributariodefensor@gmail.com).</w:t>
       </w:r>
     </w:p>
-    <w:tbl>
-      <w:tblPr>
-        <w:tblStyle w:val="LightGrid-Accent1"/>
-        <w:tblW w:type="auto" w:w="0"/>
-        <w:tblLook w:firstColumn="1" w:firstRow="1" w:lastColumn="0" w:lastRow="0" w:noHBand="0" w:noVBand="1" w:val="04A0"/>
-      </w:tblPr>
-      <w:tblGrid>
-        <w:gridCol w:w="1234"/>
-        <w:gridCol w:w="1234"/>
-        <w:gridCol w:w="1234"/>
-        <w:gridCol w:w="1234"/>
-        <w:gridCol w:w="1234"/>
-        <w:gridCol w:w="1234"/>
-        <w:gridCol w:w="1234"/>
-      </w:tblGrid>
-      <w:tr>
-        <w:tc>
-          <w:tcPr>
-            <w:tcW w:type="dxa" w:w="1234"/>
-          </w:tcPr>
-          <w:p>
-            <w:r>
-              <w:t>#</w:t>
-            </w:r>
-          </w:p>
-        </w:tc>
-        <w:tc>
-          <w:tcPr>
-            <w:tcW w:type="dxa" w:w="1234"/>
-          </w:tcPr>
-          <w:p>
-            <w:r>
-              <w:t>Tarea / Activo</w:t>
-            </w:r>
-          </w:p>
-        </w:tc>
-        <w:tc>
-          <w:tcPr>
-            <w:tcW w:type="dxa" w:w="1234"/>
-          </w:tcPr>
-          <w:p>
-            <w:r>
-              <w:t>Tipo</w:t>
-            </w:r>
-          </w:p>
-        </w:tc>
-        <w:tc>
-          <w:tcPr>
-            <w:tcW w:type="dxa" w:w="1234"/>
-          </w:tcPr>
-          <w:p>
-            <w:r>
-              <w:t>Responsable</w:t>
-            </w:r>
-          </w:p>
-        </w:tc>
-        <w:tc>
-          <w:tcPr>
-            <w:tcW w:type="dxa" w:w="1234"/>
-          </w:tcPr>
-          <w:p>
-            <w:r>
-              <w:t>Impacto</w:t>
-            </w:r>
-          </w:p>
-        </w:tc>
-        <w:tc>
-          <w:tcPr>
-            <w:tcW w:type="dxa" w:w="1234"/>
-          </w:tcPr>
-          <w:p>
-            <w:r>
-              <w:t>Tiempo estimado</w:t>
-            </w:r>
-          </w:p>
-        </w:tc>
-        <w:tc>
-          <w:tcPr>
-            <w:tcW w:type="dxa" w:w="1234"/>
-          </w:tcPr>
-          <w:p>
-            <w:r>
-              <w:t>Notas / criterios de aceptación</w:t>
-            </w:r>
-          </w:p>
-        </w:tc>
-      </w:tr>
-      <w:tr>
-        <w:tc>
-          <w:tcPr>
-            <w:tcW w:type="dxa" w:w="1234"/>
-          </w:tcPr>
-          <w:p>
-            <w:r>
-              <w:t>G16</w:t>
-            </w:r>
-          </w:p>
-        </w:tc>
-        <w:tc>
-          <w:tcPr>
-            <w:tcW w:type="dxa" w:w="1234"/>
-          </w:tcPr>
-          <w:p>
-            <w:r>
-              <w:t>Ejecutar auditoría GA4 en vivo con datos reales (tráfico, conversiones, embudos, tiempo real) vía MCP oficial</w:t>
-            </w:r>
-          </w:p>
-        </w:tc>
-        <w:tc>
-          <w:tcPr>
-            <w:tcW w:type="dxa" w:w="1234"/>
-          </w:tcPr>
-          <w:p>
-            <w:r>
-              <w:t>Tarea</w:t>
-            </w:r>
-          </w:p>
-        </w:tc>
-        <w:tc>
-          <w:tcPr>
-            <w:tcW w:type="dxa" w:w="1234"/>
-          </w:tcPr>
-          <w:p>
-            <w:r>
-              <w:t>Cliente-Estudio (vía Claude Code)</w:t>
-            </w:r>
-          </w:p>
-        </w:tc>
-        <w:tc>
-          <w:tcPr>
-            <w:tcW w:type="dxa" w:w="1234"/>
-          </w:tcPr>
-          <w:p>
-            <w:r>
-              <w:t>Alto</w:t>
-            </w:r>
-          </w:p>
-        </w:tc>
-        <w:tc>
-          <w:tcPr>
-            <w:tcW w:type="dxa" w:w="1234"/>
-          </w:tcPr>
-          <w:p>
-            <w:r>
-              <w:t>10-15 min</w:t>
-            </w:r>
-          </w:p>
-        </w:tc>
-        <w:tc>
-          <w:tcPr>
-            <w:tcW w:type="dxa" w:w="1234"/>
-          </w:tcPr>
-          <w:p>
-            <w:r>
-              <w:t>Requiere reiniciar la sesión de Claude Code para cargar el servidor analytics-mcp ya configurado</w:t>
-            </w:r>
-          </w:p>
-        </w:tc>
-      </w:tr>
-    </w:tbl>
-    <w:p/>
     <w:p>
       <w:pPr>
         <w:pStyle w:val="Heading1"/>
@@ -1699,7 +1283,7 @@
         <w:pStyle w:val="ListBullet"/>
       </w:pPr>
       <w:r>
-        <w:t>16 tareas (G1-G16): 10 de Agencia-prestador, 3 conjuntas (Cliente-Estudio define/aprueba, Agencia implementa), 2 de Cliente-Estudio, 1 de ejecución directa vía Claude Code.</w:t>
+        <w:t>10 tareas (G1-G10): 7 de Agencia-prestador, 2 conjuntas (Cliente-Estudio decide/revisa, Agencia ejecuta), 1 de reunion conjunta.</w:t>
       </w:r>
     </w:p>
     <w:p>
@@ -1707,7 +1291,7 @@
         <w:pStyle w:val="ListBullet"/>
       </w:pPr>
       <w:r>
-        <w:t>Prioridad de secuencia sugerida: 1 (tracking) -&gt; 2 (conversiones) -&gt; 3 (vinculacion Ads/Meta) -&gt; 4 (calidad de datos).</w:t>
+        <w:t>Quick wins (menos de 30 min): G1, G2, G6, G7 - resuelven la perdida de 19 conversiones/mes y dos errores de configuracion, sin desarrollo.</w:t>
       </w:r>
     </w:p>
     <w:p>
@@ -1715,7 +1299,7 @@
         <w:pStyle w:val="ListBullet"/>
       </w:pPr>
       <w:r>
-        <w:t>La seccion 5 puede correr en paralelo apenas se reinicie la sesion, no bloquea el resto.</w:t>
+        <w:t>Prioridad de secuencia sugerida: 1 (conversiones) -&gt; 2 (tracking ausente) -&gt; 3 (configuracion) -&gt; 4 (cross-domain, depende de G8) -&gt; 5 (experiencia de conversion, puede correr en paralelo).</w:t>
       </w:r>
     </w:p>
     <w:sectPr>

</xml_diff>

<commit_message>
Backlog GA4 v2: nota de metodo actualizada + tarea G11 (Word)
</commit_message>
<xml_diff>
--- a/descargables/Backlog-ClickUp-GA4.docx
+++ b/descargables/Backlog-ClickUp-GA4.docx
@@ -18,7 +18,7 @@
         <w:t xml:space="preserve">Fecha: </w:t>
       </w:r>
       <w:r>
-        <w:t>18-08-2026</w:t>
+        <w:t>19-08-2026 (segunda corrida, reemplaza la versión del 18-08-2026)</w:t>
         <w:br/>
       </w:r>
       <w:r>
@@ -46,7 +46,7 @@
         <w:rPr>
           <w:i/>
         </w:rPr>
-        <w:t>Nota de método: la sesión interactiva de Claude Code no logró cargar el servidor MCP de Google Analytics recién instalado, ni tras un reinicio. Se conectó manualmente hablando el protocolo MCP (JSON-RPC sobre stdio) directamente contra el proceso pipx run analytics-mcp, con las mismas credenciales ya configuradas — los datos de este backlog son reales, no estimados. Algunas tareas de la primera versión de este backlog quedaron corregidas o eliminadas al confirmarse con datos reales.</w:t>
+        <w:t>Nota de método: en la primera corrida (18-08-2026), la sesión interactiva de Claude Code no logró cargar el servidor MCP de Google Analytics recién instalado, ni tras un reinicio, y se conectó manualmente hablando el protocolo MCP (JSON-RPC sobre stdio) directamente contra el proceso pipx run analytics-mcp. En esta segunda corrida (19-08-2026) el servidor cargó de forma nativa en la sesión y todas las consultas se hicieron con la herramienta oficial integrada — mismos resultados, sin diferencias relevantes entre ambas corridas. Los datos de este backlog son reales en ambos casos, no estimados.</w:t>
       </w:r>
     </w:p>
     <w:p>
@@ -1252,6 +1252,78 @@
           </w:p>
         </w:tc>
       </w:tr>
+      <w:tr>
+        <w:tc>
+          <w:tcPr>
+            <w:tcW w:type="dxa" w:w="1234"/>
+          </w:tcPr>
+          <w:p>
+            <w:r>
+              <w:t>G11</w:t>
+            </w:r>
+          </w:p>
+        </w:tc>
+        <w:tc>
+          <w:tcPr>
+            <w:tcW w:type="dxa" w:w="1234"/>
+          </w:tcPr>
+          <w:p>
+            <w:r>
+              <w:t>Confirmar si las URL de campaña con tráfico casi nulo en 30 días siguen activas en campañas pagadas</w:t>
+            </w:r>
+          </w:p>
+        </w:tc>
+        <w:tc>
+          <w:tcPr>
+            <w:tcW w:type="dxa" w:w="1234"/>
+          </w:tcPr>
+          <w:p>
+            <w:r>
+              <w:t>Tarea</w:t>
+            </w:r>
+          </w:p>
+        </w:tc>
+        <w:tc>
+          <w:tcPr>
+            <w:tcW w:type="dxa" w:w="1234"/>
+          </w:tcPr>
+          <w:p>
+            <w:r>
+              <w:t>Cliente-Estudio + Agencia</w:t>
+            </w:r>
+          </w:p>
+        </w:tc>
+        <w:tc>
+          <w:tcPr>
+            <w:tcW w:type="dxa" w:w="1234"/>
+          </w:tcPr>
+          <w:p>
+            <w:r>
+              <w:t>Medio</w:t>
+            </w:r>
+          </w:p>
+        </w:tc>
+        <w:tc>
+          <w:tcPr>
+            <w:tcW w:type="dxa" w:w="1234"/>
+          </w:tcPr>
+          <w:p>
+            <w:r>
+              <w:t>1 hora</w:t>
+            </w:r>
+          </w:p>
+        </w:tc>
+        <w:tc>
+          <w:tcPr>
+            <w:tcW w:type="dxa" w:w="1234"/>
+          </w:tcPr>
+          <w:p>
+            <w:r>
+              <w:t>preguntas-frecuentes-prescripcion-tributaria (3 vistas), servicios./convenios-condonaciones (5 vistas/1 sesión), servicios./blog/perdonazo-tributario-2022 (1 vista)</w:t>
+            </w:r>
+          </w:p>
+        </w:tc>
+      </w:tr>
     </w:tbl>
     <w:p/>
     <w:p>
@@ -1283,7 +1355,7 @@
         <w:pStyle w:val="ListBullet"/>
       </w:pPr>
       <w:r>
-        <w:t>10 tareas (G1-G10): 7 de Agencia-prestador, 2 conjuntas (Cliente-Estudio decide/revisa, Agencia ejecuta), 1 de reunion conjunta.</w:t>
+        <w:t>11 tareas (G1-G11): 7 de Agencia-prestador, 2 conjuntas (Cliente-Estudio decide/revisa, Agencia ejecuta), 2 de reunion/revision conjunta.</w:t>
       </w:r>
     </w:p>
     <w:p>

</xml_diff>